<commit_message>
docs: point technical document and submission template at the real repo URL
</commit_message>
<xml_diff>
--- a/docs/Documento_Tecnico_SegundoCorte.docx
+++ b/docs/Documento_Tecnico_SegundoCorte.docx
@@ -83,17 +83,14 @@
       <w:r>
         <w:t xml:space="preserve">Repositorio: </w:t>
       </w:r>
-      <w:hyperlink w:history="1" r:id="rIdxiboxjexec3d7muj_ehpl">
+      <w:hyperlink w:history="1" r:id="rIdunqwznypr0tbyljfc3dwy">
         <w:r>
           <w:rPr>
             <w:rStyle w:val="Hyperlink"/>
           </w:rPr>
-          <w:t xml:space="preserve">https://github.com/USUARIO/REPOSITORIO</w:t>
+          <w:t xml:space="preserve">https://github.com/Facabore/practica-hsf-segundo-corte</w:t>
         </w:r>
       </w:hyperlink>
-      <w:r>
-        <w:t xml:space="preserve"> (reemplazar por la URL real)</w:t>
-      </w:r>
     </w:p>
     <w:p>
       <w:pPr>

</xml_diff>

<commit_message>
docs: update test count to 28 after the env-var privacy test
</commit_message>
<xml_diff>
--- a/docs/Documento_Tecnico_SegundoCorte.docx
+++ b/docs/Documento_Tecnico_SegundoCorte.docx
@@ -83,7 +83,7 @@
       <w:r>
         <w:t xml:space="preserve">Repositorio: </w:t>
       </w:r>
-      <w:hyperlink w:history="1" r:id="rIdunqwznypr0tbyljfc3dwy">
+      <w:hyperlink w:history="1" r:id="rIdnt5jgxoxt3h0jkdu_14pr">
         <w:r>
           <w:rPr>
             <w:rStyle w:val="Hyperlink"/>
@@ -736,7 +736,7 @@
         <w:t xml:space="preserve">TDD real, no retroactivo.</w:t>
       </w:r>
       <w:r>
-        <w:t xml:space="preserve"> Las 27 pruebas de tests/ se escribieron antes que su implementación correspondiente, confirmando en rojo antes de pasar a verde. Esta disciplina encontró un defecto real durante la construcción: antes de envolver registrar_lectura_csv en un try/except, una ruta de persistencia inaccesible tumbaba toda la aplicación — una violación directa del RF09. Se corrigió escribiendo primero la prueba que exigía el comportamiento correcto (test_ejecutar_continua_si_falla_la_persistencia).</w:t>
+        <w:t xml:space="preserve"> Las 28 pruebas de tests/ se escribieron antes que su implementación correspondiente, confirmando en rojo antes de pasar a verde. Esta disciplina encontró un defecto real durante la construcción: antes de envolver registrar_lectura_csv en un try/except, una ruta de persistencia inaccesible tumbaba toda la aplicación — una violación directa del RF09. Se corrigió escribiendo primero la prueba que exigía el comportamiento correcto (test_ejecutar_continua_si_falla_la_persistencia).</w:t>
       </w:r>
     </w:p>
     <w:p>
@@ -1169,7 +1169,7 @@
                 <w:sz w:val="18"/>
                 <w:szCs w:val="18"/>
               </w:rPr>
-              <w:t xml:space="preserve">os_resources.py + 2 pruebas</w:t>
+              <w:t xml:space="preserve">os_resources.py + 3 pruebas</w:t>
             </w:r>
           </w:p>
         </w:tc>
@@ -1416,7 +1416,7 @@
         <w:jc w:val="both"/>
       </w:pPr>
       <w:r>
-        <w:t xml:space="preserve">27 pruebas automáticas en tests/, todas en verde (pytest tests/ -v), cubriendo validación, clasificación, recursos del SO, adquisición (con sockets reales en hilo local), persistencia y el orquestador completo (incluyendo reconexión y fallas de persistencia). La matriz completa, cruzando cada caso con su evidencia automática y manual, está en docs/Matriz_Pruebas.md.</w:t>
+        <w:t xml:space="preserve">28 pruebas automáticas en tests/, todas en verde (pytest tests/ -v), cubriendo validación, clasificación, recursos del SO, adquisición (con sockets reales en hilo local), persistencia y el orquestador completo (incluyendo reconexión y fallas de persistencia). La matriz completa, cruzando cada caso con su evidencia automática y manual, está en docs/Matriz_Pruebas.md.</w:t>
       </w:r>
     </w:p>
     <w:p>

</xml_diff>

<commit_message>
docs: cover the live dashboard demo and the three new defects
README, video script and narration now record the fault demo from the
dashboard; the test matrix adds TP-09/TP-10, and the technical document
(7 pages) explains the dashboard, its defenses and the Windows
SO_REUSEADDR finding.
</commit_message>
<xml_diff>
--- a/docs/Documento_Tecnico_SegundoCorte.docx
+++ b/docs/Documento_Tecnico_SegundoCorte.docx
@@ -83,7 +83,7 @@
       <w:r>
         <w:t xml:space="preserve">Repositorio: </w:t>
       </w:r>
-      <w:hyperlink w:history="1" r:id="rIdnt5jgxoxt3h0jkdu_14pr">
+      <w:hyperlink w:history="1" r:id="rIddnxtjdxeeqkob6uz1ckg0">
         <w:r>
           <w:rPr>
             <w:rStyle w:val="Hyperlink"/>
@@ -606,6 +606,59 @@
           </w:p>
         </w:tc>
       </w:tr>
+      <w:tr>
+        <w:tc>
+          <w:tcPr>
+            <w:tcW w:type="dxa" w:w="1404"/>
+            <w:vAlign w:val="center"/>
+          </w:tcPr>
+          <w:p>
+            <w:r>
+              <w:rPr>
+                <w:b w:val="false"/>
+                <w:bCs w:val="false"/>
+                <w:sz w:val="18"/>
+                <w:szCs w:val="18"/>
+              </w:rPr>
+              <w:t xml:space="preserve">Presentación</w:t>
+            </w:r>
+          </w:p>
+        </w:tc>
+        <w:tc>
+          <w:tcPr>
+            <w:tcW w:type="dxa" w:w="5014"/>
+            <w:vAlign w:val="center"/>
+          </w:tcPr>
+          <w:p>
+            <w:r>
+              <w:rPr>
+                <w:b w:val="false"/>
+                <w:bCs w:val="false"/>
+                <w:sz w:val="18"/>
+                <w:szCs w:val="18"/>
+              </w:rPr>
+              <w:t xml:space="preserve">Dashboard web en vivo: estado, gráficas, indicadores, recursos del SO, eventos y fallos controlados</w:t>
+            </w:r>
+          </w:p>
+        </w:tc>
+        <w:tc>
+          <w:tcPr>
+            <w:tcW w:type="dxa" w:w="2608"/>
+            <w:vAlign w:val="center"/>
+          </w:tcPr>
+          <w:p>
+            <w:r>
+              <w:rPr>
+                <w:b w:val="false"/>
+                <w:bCs w:val="false"/>
+                <w:sz w:val="18"/>
+                <w:szCs w:val="18"/>
+              </w:rPr>
+              <w:t xml:space="preserve">hsf_app/dashboard.py, hsf_app/web/</w:t>
+            </w:r>
+          </w:p>
+        </w:tc>
+      </w:tr>
     </w:tbl>
     <w:p>
       <w:pPr>
@@ -736,7 +789,7 @@
         <w:t xml:space="preserve">TDD real, no retroactivo.</w:t>
       </w:r>
       <w:r>
-        <w:t xml:space="preserve"> Las 28 pruebas de tests/ se escribieron antes que su implementación correspondiente, confirmando en rojo antes de pasar a verde. Esta disciplina encontró un defecto real durante la construcción: antes de envolver registrar_lectura_csv en un try/except, una ruta de persistencia inaccesible tumbaba toda la aplicación — una violación directa del RF09. Se corrigió escribiendo primero la prueba que exigía el comportamiento correcto (test_ejecutar_continua_si_falla_la_persistencia).</w:t>
+        <w:t xml:space="preserve"> Las 64 pruebas de tests/ se escribieron antes que su implementación correspondiente, confirmando en rojo antes de pasar a verde. Esta disciplina encontró un defecto real durante la construcción: antes de envolver registrar_lectura_csv en un try/except, una ruta de persistencia inaccesible tumbaba toda la aplicación — una violación directa del RF09. Se corrigió escribiendo primero la prueba que exigía el comportamiento correcto (test_ejecutar_continua_si_falla_la_persistencia).</w:t>
       </w:r>
     </w:p>
     <w:p>
@@ -769,6 +822,22 @@
       </w:r>
       <w:r>
         <w:t xml:space="preserve"> Un reintento inmediato y constante satura la red o el proceso remoto si la caída es prolongada. El backoff creciente (1, 2, 4, 8 segundos) da tiempo a que el firmware se recupere sin convertir la aplicación en un bucle ocupado.</w:t>
+      </w:r>
+    </w:p>
+    <w:p>
+      <w:pPr>
+        <w:spacing w:after="160"/>
+        <w:jc w:val="both"/>
+      </w:pPr>
+      <w:r>
+        <w:rPr>
+          <w:b/>
+          <w:bCs/>
+        </w:rPr>
+        <w:t xml:space="preserve">Dashboard con la librería estándar, sin frameworks.</w:t>
+      </w:r>
+      <w:r>
+        <w:t xml:space="preserve"> El panel en vivo usa http.server y gráficas SVG dibujadas a mano, sin Flask ni librerías de gráficos por CDN, así funciona sin internet el día de la demostración. El orquestador no conoce el dashboard: solo informa sus eventos a un objeto de estado compartido (patrón observador), y el servidor HTTP lee de ese objeto. Así la lógica de integración se sigue probando sin red.</w:t>
       </w:r>
     </w:p>
     <w:p>
@@ -1169,7 +1238,7 @@
                 <w:sz w:val="18"/>
                 <w:szCs w:val="18"/>
               </w:rPr>
-              <w:t xml:space="preserve">os_resources.py + 3 pruebas</w:t>
+              <w:t xml:space="preserve">os_resources.py + 5 pruebas</w:t>
             </w:r>
           </w:p>
         </w:tc>
@@ -1328,7 +1397,7 @@
                 <w:sz w:val="18"/>
                 <w:szCs w:val="18"/>
               </w:rPr>
-              <w:t xml:space="preserve">app.py + 5 pruebas + §6</w:t>
+              <w:t xml:space="preserve">app.py + 10 pruebas + §6</w:t>
             </w:r>
           </w:p>
         </w:tc>
@@ -1416,7 +1485,7 @@
         <w:jc w:val="both"/>
       </w:pPr>
       <w:r>
-        <w:t xml:space="preserve">28 pruebas automáticas en tests/, todas en verde (pytest tests/ -v), cubriendo validación, clasificación, recursos del SO, adquisición (con sockets reales en hilo local), persistencia y el orquestador completo (incluyendo reconexión y fallas de persistencia). La matriz completa, cruzando cada caso con su evidencia automática y manual, está en docs/Matriz_Pruebas.md.</w:t>
+        <w:t xml:space="preserve">64 pruebas automáticas en tests/, todas en verde (pytest tests/ -v), cubriendo validación, clasificación, recursos del SO, adquisición (con sockets reales en hilo local), persistencia, el orquestador completo (incluyendo reconexión, fallas de persistencia y detención desde otro hilo), el servidor del dashboard con sus defensas, y el lanzador de la demo con el firmware como proceso real. La matriz completa, cruzando cada caso con su evidencia automática y manual, está en docs/Matriz_Pruebas.md. Construir la demo en vivo destapó tres defectos más, cada uno cubierto primero con una prueba que fallaba: un firmware "colgado" (conexión abierta, sin datos) tumbaba la aplicación; en Windows podían escuchar dos firmwares en el mismo puerto; y la CPU del dashboard marcaba siempre 0 %. El detalle está en docs/Fallos_Controlados.md.</w:t>
       </w:r>
     </w:p>
     <w:p>
@@ -2034,7 +2103,7 @@
         <w:t xml:space="preserve">¿Qué riesgos de seguridad aparecen al recibir datos externos o ejecutar comandos del sistema?</w:t>
       </w:r>
       <w:r>
-        <w:t xml:space="preserve"> El riesgo principal es tratar el dato recibido como código o como una ruta/comando sin sanear — por eso acquisition.py solo pasa la línea cruda por json.loads (nunca por eval ni por un shell), y validation.py rechaza cualquier estructura que no coincida con el esquema esperado. Un segundo riesgo es la denegación de servicio por datos malformados repetidos; se mitiga contando errores_adquisicion sin abortar el proceso.</w:t>
+        <w:t xml:space="preserve"> El riesgo principal es tratar el dato recibido como código o como una ruta/comando sin sanear — por eso acquisition.py solo pasa la línea cruda por json.loads (nunca por eval ni por un shell), y validation.py rechaza cualquier estructura que no coincida con el esquema esperado. Un segundo riesgo es la denegación de servicio por datos malformados repetidos; se mitiga contando errores_adquisicion sin abortar el proceso. El dashboard, que sí dispara acciones, escucha solo en 127.0.0.1, acepta solo una lista cerrada de comandos (el nombre de la URL se busca, nunca se ejecuta), exige una cabecera propia que un sitio ajeno no puede enviar sin permiso CORS, y rechaza cualquier Host que no sea localhost (contra DNS rebinding).</w:t>
       </w:r>
     </w:p>
     <w:p>
@@ -2066,7 +2135,7 @@
         <w:t xml:space="preserve">¿Qué diferencias podrían presentarse entre Windows y Linux?</w:t>
       </w:r>
       <w:r>
-        <w:t xml:space="preserve"> Se comprobaron dos directamente: los mensajes de error de socket difieren textualmente (WinError 10054/10061 en Windows frente a ConnectionResetError/ConnectionRefusedError en Linux, aunque ambos se capturan igual porque Python los normaliza a la misma jerarquía de excepciones); y el manejo de procesos en segundo plano cambia (por eso existen scripts/ejecutar_demo.ps1 y .sh por separado). psutil abstrae la mayoría de las diferencias de bajo nivel.</w:t>
+        <w:t xml:space="preserve"> La más seria se encontró durante la práctica: con SO_REUSEADDR, Windows deja que un segundo firmware escuche el mismo puerto que otro ya activo (las conexiones van a cualquiera de los dos), mientras que en Linux esa opción solo evita esperar el TIME_WAIT; ahora se activa solo fuera de Windows, con una prueba que lo verifica. Además, los mensajes de error de socket difieren textualmente (WinError 10054/10061 en Windows frente a ConnectionResetError/ConnectionRefusedError en Linux, aunque ambos se capturan igual porque Python los normaliza a la misma jerarquía de excepciones); y el manejo de procesos en segundo plano cambia (por eso existen scripts/ejecutar_demo.ps1 y .sh por separado). psutil abstrae la mayoría de las diferencias de bajo nivel.</w:t>
       </w:r>
     </w:p>
     <w:p>

</xml_diff>

<commit_message>
docs: document the multi-device demo, new slide and test count 78
</commit_message>
<xml_diff>
--- a/docs/Documento_Tecnico_SegundoCorte.docx
+++ b/docs/Documento_Tecnico_SegundoCorte.docx
@@ -83,7 +83,7 @@
       <w:r>
         <w:t xml:space="preserve">Repositorio: </w:t>
       </w:r>
-      <w:hyperlink w:history="1" r:id="rIddnxtjdxeeqkob6uz1ckg0">
+      <w:hyperlink w:history="1" r:id="rIdxly1nfrzuk_s1tiltosnw">
         <w:r>
           <w:rPr>
             <w:rStyle w:val="Hyperlink"/>
@@ -637,7 +637,7 @@
                 <w:sz w:val="18"/>
                 <w:szCs w:val="18"/>
               </w:rPr>
-              <w:t xml:space="preserve">Dashboard web en vivo: estado, gráficas, indicadores, recursos del SO, eventos y fallos controlados</w:t>
+              <w:t xml:space="preserve">Dashboard en vivo: vista general de la flota y una pestaña por equipo, con indicadores, recursos del SO, eventos y fallos controlados</w:t>
             </w:r>
           </w:p>
         </w:tc>
@@ -654,7 +654,7 @@
                 <w:sz w:val="18"/>
                 <w:szCs w:val="18"/>
               </w:rPr>
-              <w:t xml:space="preserve">hsf_app/dashboard.py, hsf_app/web/</w:t>
+              <w:t xml:space="preserve">hsf_app/dashboard.py, flota.py, web/</w:t>
             </w:r>
           </w:p>
         </w:tc>
@@ -789,7 +789,7 @@
         <w:t xml:space="preserve">TDD real, no retroactivo.</w:t>
       </w:r>
       <w:r>
-        <w:t xml:space="preserve"> Las 64 pruebas de tests/ se escribieron antes que su implementación correspondiente, confirmando en rojo antes de pasar a verde. Esta disciplina encontró un defecto real durante la construcción: antes de envolver registrar_lectura_csv en un try/except, una ruta de persistencia inaccesible tumbaba toda la aplicación — una violación directa del RF09. Se corrigió escribiendo primero la prueba que exigía el comportamiento correcto (test_ejecutar_continua_si_falla_la_persistencia).</w:t>
+        <w:t xml:space="preserve"> Las 78 pruebas de tests/ se escribieron antes que su implementación correspondiente, confirmando en rojo antes de pasar a verde. Esta disciplina encontró un defecto real durante la construcción: antes de envolver registrar_lectura_csv en un try/except, una ruta de persistencia inaccesible tumbaba toda la aplicación — una violación directa del RF09. Se corrigió escribiendo primero la prueba que exigía el comportamiento correcto (test_ejecutar_continua_si_falla_la_persistencia).</w:t>
       </w:r>
     </w:p>
     <w:p>
@@ -838,6 +838,22 @@
       </w:r>
       <w:r>
         <w:t xml:space="preserve"> El panel en vivo usa http.server y gráficas SVG dibujadas a mano, sin Flask ni librerías de gráficos por CDN, así funciona sin internet el día de la demostración. El orquestador no conoce el dashboard: solo informa sus eventos a un objeto de estado compartido (patrón observador), y el servidor HTTP lee de ese objeto. Así la lógica de integración se sigue probando sin red.</w:t>
+      </w:r>
+    </w:p>
+    <w:p>
+      <w:pPr>
+        <w:spacing w:after="160"/>
+        <w:jc w:val="both"/>
+      </w:pPr>
+      <w:r>
+        <w:rPr>
+          <w:b/>
+          <w:bCs/>
+        </w:rPr>
+        <w:t xml:space="preserve">Varios dispositivos: un orquestador por equipo, no un orquestador más complejo.</w:t>
+      </w:r>
+      <w:r>
+        <w:t xml:space="preserve"> Para la demo multi-dispositivo no se tocó la lógica de integración: se corre una instancia del mismo OrquestadorHSF por equipo, cada una con su conexión, su estado y su CSV (un archivo por equipo evita escrituras concurrentes), y una capa de flota solo las reúne para la vista general. Las gráficas usan el tiempo real como eje, así que un equipo caído deja un hueco visible en vez de estirar su línea, y cada equipo conserva el mismo color en todas las vistas.</w:t>
       </w:r>
     </w:p>
     <w:p>
@@ -956,7 +972,7 @@
                 <w:sz w:val="18"/>
                 <w:szCs w:val="18"/>
               </w:rPr>
-              <w:t xml:space="preserve">Cada trama trae device_id; el firmware escribe device_manifest.json</w:t>
+              <w:t xml:space="preserve">Cada trama trae device_id (--device-id); cada firmware escribe su device_manifest_&lt;id&gt;.json</w:t>
             </w:r>
           </w:p>
         </w:tc>
@@ -1485,7 +1501,7 @@
         <w:jc w:val="both"/>
       </w:pPr>
       <w:r>
-        <w:t xml:space="preserve">64 pruebas automáticas en tests/, todas en verde (pytest tests/ -v), cubriendo validación, clasificación, recursos del SO, adquisición (con sockets reales en hilo local), persistencia, el orquestador completo (incluyendo reconexión, fallas de persistencia y detención desde otro hilo), el servidor del dashboard con sus defensas, y el lanzador de la demo con el firmware como proceso real. La matriz completa, cruzando cada caso con su evidencia automática y manual, está en docs/Matriz_Pruebas.md. Construir la demo en vivo destapó tres defectos más, cada uno cubierto primero con una prueba que fallaba: un firmware "colgado" (conexión abierta, sin datos) tumbaba la aplicación; en Windows podían escuchar dos firmwares en el mismo puerto; y la CPU del dashboard marcaba siempre 0 %. El detalle está en docs/Fallos_Controlados.md.</w:t>
+        <w:t xml:space="preserve">78 pruebas automáticas en tests/, todas en verde (pytest tests/ -v), cubriendo validación, clasificación, recursos del SO, adquisición (con sockets reales en hilo local), persistencia, el orquestador completo (incluyendo reconexión, fallas de persistencia y detención desde otro hilo), el servidor del dashboard con sus defensas, y el lanzador de la demo con el firmware como proceso real. La matriz completa, cruzando cada caso con su evidencia automática y manual, está en docs/Matriz_Pruebas.md. Construir la demo en vivo destapó tres defectos más, cada uno cubierto primero con una prueba que fallaba: un firmware "colgado" (conexión abierta, sin datos) tumbaba la aplicación; en Windows podían escuchar dos firmwares en el mismo puerto; y la CPU del dashboard marcaba siempre 0 %. El detalle está en docs/Fallos_Controlados.md.</w:t>
       </w:r>
     </w:p>
     <w:p>
@@ -2087,7 +2103,7 @@
         <w:t xml:space="preserve">¿Cómo cambiaría la arquitectura si se conectaran 100 dispositivos simultáneamente?</w:t>
       </w:r>
       <w:r>
-        <w:t xml:space="preserve"> El modelo actual (un socket por conexión, atendido secuencialmente) no escala a eso. Se necesitaría un servidor TCP asíncrono o con pool de hilos/procesos que acepte múltiples conexiones en paralelo, identificar cada dispositivo en la capa de persistencia, y probablemente una cola de mensajes (p. ej. MQTT) en vez de sockets TCP directos, para desacoplar la velocidad de ingestión de la de procesamiento.</w:t>
+        <w:t xml:space="preserve"> El primer paso ya está implementado y probado: la demo levanta tres equipos a la vez (compresor, bomba de agua y motor de banda), cada uno con su proceso de firmware, puerto y ritmo de anomalías; la aplicación abre una conexión por equipo, cada una en su hilo, y una capa de flota suma las métricas para la vista general. Detener un equipo no afecta a los demás: con SIM-002 caído, SIM-001 y SIM-003 siguieron de 76 a 79 lecturas. Para llegar a 100 harían falta tres cambios más: un servidor asíncrono (asyncio) en lugar de hilos; invertir la conexión, para que cada dispositivo se conecte a la aplicación e indique su device_id, como los equipos IoT reales detrás de NAT; y probablemente una cola de mensajes como MQTT, para desacoplar la ingestión del procesamiento.</w:t>
       </w:r>
     </w:p>
     <w:p>
@@ -2183,7 +2199,7 @@
         <w:t xml:space="preserve">¿Qué componente sería el principal punto de falla y cómo lo convertiría en un componente tolerante a fallos?</w:t>
       </w:r>
       <w:r>
-        <w:t xml:space="preserve"> El socket único hacia un único firmware, como demuestra el fallo 1: si cae y no vuelve, no hay datos. Para tolerarlo, se introduciría redundancia (más de una fuente de datos o failover automático) y se separaría la adquisición de la persistencia mediante una cola intermedia, para que una caída de la fuente no bloquee el resto del pipeline.</w:t>
+        <w:t xml:space="preserve"> El socket hacia cada firmware, como demuestra el fallo 1: si cae y no vuelve, ese equipo deja de enviar datos. Con varios equipos la caída queda aislada a uno, pero la aplicación sigue siendo un único proceso. Para tolerarlo, se introduciría redundancia (más de una fuente de datos o failover automático) y se separaría la adquisición de la persistencia mediante una cola intermedia, para que una caída de la fuente no bloquee el resto del pipeline.</w:t>
       </w:r>
     </w:p>
     <w:p>
@@ -2210,7 +2226,7 @@
         <w:jc w:val="both"/>
       </w:pPr>
       <w:r>
-        <w:t xml:space="preserve">La limitación más relevante del prototipo es su escala: funciona para un dispositivo a la vez por diseño, y la pregunta de la sección 8 sobre 100 dispositivos simultáneos señala exactamente dónde habría que invertir el siguiente esfuerzo de ingeniería.</w:t>
+        <w:t xml:space="preserve">La integración ya funciona con tres dispositivos en paralelo, aislados entre sí ante fallas. La limitación que queda es la escala: un hilo por equipo sirve para decenas, no para cientos. La pregunta de la sección 8 sobre 100 dispositivos señala dónde iría el siguiente esfuerzo de ingeniería: un servidor asíncrono, invertir la conexión y MQTT.</w:t>
       </w:r>
     </w:p>
     <w:p>

</xml_diff>

<commit_message>
docs: document the public cloud deployment and polish the read-only notice
</commit_message>
<xml_diff>
--- a/docs/Documento_Tecnico_SegundoCorte.docx
+++ b/docs/Documento_Tecnico_SegundoCorte.docx
@@ -83,7 +83,7 @@
       <w:r>
         <w:t xml:space="preserve">Repositorio: </w:t>
       </w:r>
-      <w:hyperlink w:history="1" r:id="rIdxly1nfrzuk_s1tiltosnw">
+      <w:hyperlink w:history="1" r:id="rIdefayixysipzb_r9fpuor9">
         <w:r>
           <w:rPr>
             <w:rStyle w:val="Hyperlink"/>
@@ -838,6 +838,22 @@
       </w:r>
       <w:r>
         <w:t xml:space="preserve"> El panel en vivo usa http.server y gráficas SVG dibujadas a mano, sin Flask ni librerías de gráficos por CDN, así funciona sin internet el día de la demostración. El orquestador no conoce el dashboard: solo informa sus eventos a un objeto de estado compartido (patrón observador), y el servidor HTTP lee de ese objeto. Así la lógica de integración se sigue probando sin red.</w:t>
+      </w:r>
+    </w:p>
+    <w:p>
+      <w:pPr>
+        <w:spacing w:after="160"/>
+        <w:jc w:val="both"/>
+      </w:pPr>
+      <w:r>
+        <w:rPr>
+          <w:b/>
+          <w:bCs/>
+        </w:rPr>
+        <w:t xml:space="preserve">Publicado en la nube, en solo lectura.</w:t>
+      </w:r>
+      <w:r>
+        <w:t xml:space="preserve"> La demo corre como servicio systemd en un VPS Ubuntu, detrás de Caddy con HTTPS automático (Let's Encrypt), en https://integration-corte2.duckdns.org. Todo escucha en 127.0.0.1 y solo Caddy queda expuesto; el servicio usa un usuario sin privilegios que solo puede escribir en data/ y logs/, con techo de CPU y memoria porque el servidor es compartido. En internet los botones de fallos están desactivados (la API responde 403), para que nadie pueda saturar la CPU de un servidor compartido; los fallos se demuestran con la demo local. Detalle en deploy/DESPLIEGUE.md.</w:t>
       </w:r>
     </w:p>
     <w:p>

</xml_diff>

<commit_message>
docs: describe on/off/restart controls and open cloud dashboard
</commit_message>
<xml_diff>
--- a/docs/Documento_Tecnico_SegundoCorte.docx
+++ b/docs/Documento_Tecnico_SegundoCorte.docx
@@ -83,7 +83,7 @@
       <w:r>
         <w:t xml:space="preserve">Repositorio: </w:t>
       </w:r>
-      <w:hyperlink w:history="1" r:id="rIdefayixysipzb_r9fpuor9">
+      <w:hyperlink w:history="1" r:id="rIdskvosnnb7lyoocy1fq3pd">
         <w:r>
           <w:rPr>
             <w:rStyle w:val="Hyperlink"/>
@@ -789,7 +789,7 @@
         <w:t xml:space="preserve">TDD real, no retroactivo.</w:t>
       </w:r>
       <w:r>
-        <w:t xml:space="preserve"> Las 78 pruebas de tests/ se escribieron antes que su implementación correspondiente, confirmando en rojo antes de pasar a verde. Esta disciplina encontró un defecto real durante la construcción: antes de envolver registrar_lectura_csv en un try/except, una ruta de persistencia inaccesible tumbaba toda la aplicación — una violación directa del RF09. Se corrigió escribiendo primero la prueba que exigía el comportamiento correcto (test_ejecutar_continua_si_falla_la_persistencia).</w:t>
+        <w:t xml:space="preserve"> Las 85 pruebas de tests/ se escribieron antes que su implementación correspondiente, confirmando en rojo antes de pasar a verde. Esta disciplina encontró un defecto real durante la construcción: antes de envolver registrar_lectura_csv en un try/except, una ruta de persistencia inaccesible tumbaba toda la aplicación — una violación directa del RF09. Se corrigió escribiendo primero la prueba que exigía el comportamiento correcto (test_ejecutar_continua_si_falla_la_persistencia).</w:t>
       </w:r>
     </w:p>
     <w:p>
@@ -850,10 +850,10 @@
           <w:b/>
           <w:bCs/>
         </w:rPr>
-        <w:t xml:space="preserve">Publicado en la nube, en solo lectura.</w:t>
-      </w:r>
-      <w:r>
-        <w:t xml:space="preserve"> La demo corre como servicio systemd en un VPS Ubuntu, detrás de Caddy con HTTPS automático (Let's Encrypt), en https://integration-corte2.duckdns.org. Todo escucha en 127.0.0.1 y solo Caddy queda expuesto; el servicio usa un usuario sin privilegios que solo puede escribir en data/ y logs/, con techo de CPU y memoria porque el servidor es compartido. En internet los botones de fallos están desactivados (la API responde 403), para que nadie pueda saturar la CPU de un servidor compartido; los fallos se demuestran con la demo local. Detalle en deploy/DESPLIEGUE.md.</w:t>
+        <w:t xml:space="preserve">Publicado en la nube, con controles abiertos.</w:t>
+      </w:r>
+      <w:r>
+        <w:t xml:space="preserve"> La demo corre como servicio systemd en un VPS Ubuntu, detrás de Caddy con HTTPS automático (Let's Encrypt), en https://integration-corte2.duckdns.org. Todo escucha en 127.0.0.1 y solo Caddy queda expuesto; el servicio usa un usuario sin privilegios que solo puede escribir en data/ y logs/, con techo de 1 CPU y 400 MB porque el servidor es compartido. Por decisión del dueño del servidor, los botones de cada equipo (encender, apagar, reiniciar y fallos) funcionan sin clave. Siguen activas las listas cerradas de comandos y equipos, la cabecera propia contra CSRF, el control de Host contra DNS rebinding y el techo de CPU del servicio, que contiene a Saturar CPU para que no afecte a los demás sitios. Riesgo aceptado: cualquier visitante puede apagar un equipo, y cualquiera puede volver a encenderlo. Con --solo-lectura se vuelve a publicar sin controles. Detalle en deploy/DESPLIEGUE.md.</w:t>
       </w:r>
     </w:p>
     <w:p>
@@ -1517,7 +1517,7 @@
         <w:jc w:val="both"/>
       </w:pPr>
       <w:r>
-        <w:t xml:space="preserve">78 pruebas automáticas en tests/, todas en verde (pytest tests/ -v), cubriendo validación, clasificación, recursos del SO, adquisición (con sockets reales en hilo local), persistencia, el orquestador completo (incluyendo reconexión, fallas de persistencia y detención desde otro hilo), el servidor del dashboard con sus defensas, y el lanzador de la demo con el firmware como proceso real. La matriz completa, cruzando cada caso con su evidencia automática y manual, está en docs/Matriz_Pruebas.md. Construir la demo en vivo destapó tres defectos más, cada uno cubierto primero con una prueba que fallaba: un firmware "colgado" (conexión abierta, sin datos) tumbaba la aplicación; en Windows podían escuchar dos firmwares en el mismo puerto; y la CPU del dashboard marcaba siempre 0 %. El detalle está en docs/Fallos_Controlados.md.</w:t>
+        <w:t xml:space="preserve">85 pruebas automáticas en tests/, todas en verde (pytest tests/ -v), cubriendo validación, clasificación, recursos del SO, adquisición (con sockets reales en hilo local), persistencia, el orquestador completo (incluyendo reconexión, fallas de persistencia y detención desde otro hilo), el servidor del dashboard con sus defensas, y el lanzador de la demo con el firmware como proceso real. La matriz completa, cruzando cada caso con su evidencia automática y manual, está en docs/Matriz_Pruebas.md. Construir la demo en vivo destapó tres defectos más, cada uno cubierto primero con una prueba que fallaba: un firmware "colgado" (conexión abierta, sin datos) tumbaba la aplicación; en Windows podían escuchar dos firmwares en el mismo puerto; y la CPU del dashboard marcaba siempre 0 %. El detalle está en docs/Fallos_Controlados.md.</w:t>
       </w:r>
     </w:p>
     <w:p>

</xml_diff>

<commit_message>
docs: update test count to 87
</commit_message>
<xml_diff>
--- a/docs/Documento_Tecnico_SegundoCorte.docx
+++ b/docs/Documento_Tecnico_SegundoCorte.docx
@@ -83,7 +83,7 @@
       <w:r>
         <w:t xml:space="preserve">Repositorio: </w:t>
       </w:r>
-      <w:hyperlink w:history="1" r:id="rIdskvosnnb7lyoocy1fq3pd">
+      <w:hyperlink w:history="1" r:id="rIdvs3t87oaagv0vzap5-pw6">
         <w:r>
           <w:rPr>
             <w:rStyle w:val="Hyperlink"/>
@@ -789,7 +789,7 @@
         <w:t xml:space="preserve">TDD real, no retroactivo.</w:t>
       </w:r>
       <w:r>
-        <w:t xml:space="preserve"> Las 85 pruebas de tests/ se escribieron antes que su implementación correspondiente, confirmando en rojo antes de pasar a verde. Esta disciplina encontró un defecto real durante la construcción: antes de envolver registrar_lectura_csv en un try/except, una ruta de persistencia inaccesible tumbaba toda la aplicación — una violación directa del RF09. Se corrigió escribiendo primero la prueba que exigía el comportamiento correcto (test_ejecutar_continua_si_falla_la_persistencia).</w:t>
+        <w:t xml:space="preserve"> Las 87 pruebas de tests/ se escribieron antes que su implementación correspondiente, confirmando en rojo antes de pasar a verde. Esta disciplina encontró un defecto real durante la construcción: antes de envolver registrar_lectura_csv en un try/except, una ruta de persistencia inaccesible tumbaba toda la aplicación — una violación directa del RF09. Se corrigió escribiendo primero la prueba que exigía el comportamiento correcto (test_ejecutar_continua_si_falla_la_persistencia).</w:t>
       </w:r>
     </w:p>
     <w:p>
@@ -1517,7 +1517,7 @@
         <w:jc w:val="both"/>
       </w:pPr>
       <w:r>
-        <w:t xml:space="preserve">85 pruebas automáticas en tests/, todas en verde (pytest tests/ -v), cubriendo validación, clasificación, recursos del SO, adquisición (con sockets reales en hilo local), persistencia, el orquestador completo (incluyendo reconexión, fallas de persistencia y detención desde otro hilo), el servidor del dashboard con sus defensas, y el lanzador de la demo con el firmware como proceso real. La matriz completa, cruzando cada caso con su evidencia automática y manual, está en docs/Matriz_Pruebas.md. Construir la demo en vivo destapó tres defectos más, cada uno cubierto primero con una prueba que fallaba: un firmware "colgado" (conexión abierta, sin datos) tumbaba la aplicación; en Windows podían escuchar dos firmwares en el mismo puerto; y la CPU del dashboard marcaba siempre 0 %. El detalle está en docs/Fallos_Controlados.md.</w:t>
+        <w:t xml:space="preserve">87 pruebas automáticas en tests/, todas en verde (pytest tests/ -v), cubriendo validación, clasificación, recursos del SO, adquisición (con sockets reales en hilo local), persistencia, el orquestador completo (incluyendo reconexión, fallas de persistencia y detención desde otro hilo), el servidor del dashboard con sus defensas, y el lanzador de la demo con el firmware como proceso real. La matriz completa, cruzando cada caso con su evidencia automática y manual, está en docs/Matriz_Pruebas.md. Construir la demo en vivo destapó tres defectos más, cada uno cubierto primero con una prueba que fallaba: un firmware "colgado" (conexión abierta, sin datos) tumbaba la aplicación; en Windows podían escuchar dos firmwares en el mismo puerto; y la CPU del dashboard marcaba siempre 0 %. El detalle está en docs/Fallos_Controlados.md.</w:t>
       </w:r>
     </w:p>
     <w:p>

</xml_diff>

<commit_message>
docs: document the report download and update test count to 90
</commit_message>
<xml_diff>
--- a/docs/Documento_Tecnico_SegundoCorte.docx
+++ b/docs/Documento_Tecnico_SegundoCorte.docx
@@ -83,7 +83,7 @@
       <w:r>
         <w:t xml:space="preserve">Repositorio: </w:t>
       </w:r>
-      <w:hyperlink w:history="1" r:id="rIdvs3t87oaagv0vzap5-pw6">
+      <w:hyperlink w:history="1" r:id="rIdl_arqusgpu24c5xluyf9_">
         <w:r>
           <w:rPr>
             <w:rStyle w:val="Hyperlink"/>
@@ -789,7 +789,7 @@
         <w:t xml:space="preserve">TDD real, no retroactivo.</w:t>
       </w:r>
       <w:r>
-        <w:t xml:space="preserve"> Las 87 pruebas de tests/ se escribieron antes que su implementación correspondiente, confirmando en rojo antes de pasar a verde. Esta disciplina encontró un defecto real durante la construcción: antes de envolver registrar_lectura_csv en un try/except, una ruta de persistencia inaccesible tumbaba toda la aplicación — una violación directa del RF09. Se corrigió escribiendo primero la prueba que exigía el comportamiento correcto (test_ejecutar_continua_si_falla_la_persistencia).</w:t>
+        <w:t xml:space="preserve"> Las 90 pruebas de tests/ se escribieron antes que su implementación correspondiente, confirmando en rojo antes de pasar a verde. Esta disciplina encontró un defecto real durante la construcción: antes de envolver registrar_lectura_csv en un try/except, una ruta de persistencia inaccesible tumbaba toda la aplicación — una violación directa del RF09. Se corrigió escribiendo primero la prueba que exigía el comportamiento correcto (test_ejecutar_continua_si_falla_la_persistencia).</w:t>
       </w:r>
     </w:p>
     <w:p>
@@ -1359,7 +1359,7 @@
                 <w:sz w:val="18"/>
                 <w:szCs w:val="18"/>
               </w:rPr>
-              <w:t xml:space="preserve">Métricas agregadas + snapshot de recursos al cierre</w:t>
+              <w:t xml:space="preserve">Métricas agregadas + snapshot de recursos al cierre, y en cualquier momento con «Descargar reporte» del dashboard</w:t>
             </w:r>
           </w:p>
         </w:tc>
@@ -1376,7 +1376,7 @@
                 <w:sz w:val="18"/>
                 <w:szCs w:val="18"/>
               </w:rPr>
-              <w:t xml:space="preserve">app.py (MetricasEjecucion)</w:t>
+              <w:t xml:space="preserve">app.py (MetricasEjecucion) + dashboard.py (armar_reporte)</w:t>
             </w:r>
           </w:p>
         </w:tc>
@@ -1517,7 +1517,7 @@
         <w:jc w:val="both"/>
       </w:pPr>
       <w:r>
-        <w:t xml:space="preserve">87 pruebas automáticas en tests/, todas en verde (pytest tests/ -v), cubriendo validación, clasificación, recursos del SO, adquisición (con sockets reales en hilo local), persistencia, el orquestador completo (incluyendo reconexión, fallas de persistencia y detención desde otro hilo), el servidor del dashboard con sus defensas, y el lanzador de la demo con el firmware como proceso real. La matriz completa, cruzando cada caso con su evidencia automática y manual, está en docs/Matriz_Pruebas.md. Construir la demo en vivo destapó tres defectos más, cada uno cubierto primero con una prueba que fallaba: un firmware "colgado" (conexión abierta, sin datos) tumbaba la aplicación; en Windows podían escuchar dos firmwares en el mismo puerto; y la CPU del dashboard marcaba siempre 0 %. El detalle está en docs/Fallos_Controlados.md.</w:t>
+        <w:t xml:space="preserve">90 pruebas automáticas en tests/, todas en verde (pytest tests/ -v), cubriendo validación, clasificación, recursos del SO, adquisición (con sockets reales en hilo local), persistencia, el orquestador completo (incluyendo reconexión, fallas de persistencia y detención desde otro hilo), el servidor del dashboard con sus defensas, y el lanzador de la demo con el firmware como proceso real. La matriz completa, cruzando cada caso con su evidencia automática y manual, está en docs/Matriz_Pruebas.md. Construir la demo en vivo destapó tres defectos más, cada uno cubierto primero con una prueba que fallaba: un firmware "colgado" (conexión abierta, sin datos) tumbaba la aplicación; en Windows podían escuchar dos firmwares en el mismo puerto; y la CPU del dashboard marcaba siempre 0 %. El detalle está en docs/Fallos_Controlados.md.</w:t>
       </w:r>
     </w:p>
     <w:p>

</xml_diff>

<commit_message>
docs: document CSV report download and update test count to 95
</commit_message>
<xml_diff>
--- a/docs/Documento_Tecnico_SegundoCorte.docx
+++ b/docs/Documento_Tecnico_SegundoCorte.docx
@@ -83,7 +83,7 @@
       <w:r>
         <w:t xml:space="preserve">Repositorio: </w:t>
       </w:r>
-      <w:hyperlink w:history="1" r:id="rIdl_arqusgpu24c5xluyf9_">
+      <w:hyperlink w:history="1" r:id="rIdmhi0kjeedsa47pxni8tzc">
         <w:r>
           <w:rPr>
             <w:rStyle w:val="Hyperlink"/>
@@ -789,7 +789,7 @@
         <w:t xml:space="preserve">TDD real, no retroactivo.</w:t>
       </w:r>
       <w:r>
-        <w:t xml:space="preserve"> Las 90 pruebas de tests/ se escribieron antes que su implementación correspondiente, confirmando en rojo antes de pasar a verde. Esta disciplina encontró un defecto real durante la construcción: antes de envolver registrar_lectura_csv en un try/except, una ruta de persistencia inaccesible tumbaba toda la aplicación — una violación directa del RF09. Se corrigió escribiendo primero la prueba que exigía el comportamiento correcto (test_ejecutar_continua_si_falla_la_persistencia).</w:t>
+        <w:t xml:space="preserve"> Las 95 pruebas de tests/ se escribieron antes que su implementación correspondiente, confirmando en rojo antes de pasar a verde. Esta disciplina encontró un defecto real durante la construcción: antes de envolver registrar_lectura_csv en un try/except, una ruta de persistencia inaccesible tumbaba toda la aplicación — una violación directa del RF09. Se corrigió escribiendo primero la prueba que exigía el comportamiento correcto (test_ejecutar_continua_si_falla_la_persistencia).</w:t>
       </w:r>
     </w:p>
     <w:p>
@@ -1359,7 +1359,7 @@
                 <w:sz w:val="18"/>
                 <w:szCs w:val="18"/>
               </w:rPr>
-              <w:t xml:space="preserve">Métricas agregadas + snapshot de recursos al cierre, y en cualquier momento con «Descargar reporte» del dashboard</w:t>
+              <w:t xml:space="preserve">Métricas agregadas + snapshot de recursos al cierre, y en cualquier momento con «Descargar reporte» del dashboard, en JSON o CSV</w:t>
             </w:r>
           </w:p>
         </w:tc>
@@ -1376,7 +1376,7 @@
                 <w:sz w:val="18"/>
                 <w:szCs w:val="18"/>
               </w:rPr>
-              <w:t xml:space="preserve">app.py (MetricasEjecucion) + dashboard.py (armar_reporte)</w:t>
+              <w:t xml:space="preserve">app.py (MetricasEjecucion) + dashboard.py (armar_reporte) + persistence.py (reporte_a_csv)</w:t>
             </w:r>
           </w:p>
         </w:tc>
@@ -1517,7 +1517,7 @@
         <w:jc w:val="both"/>
       </w:pPr>
       <w:r>
-        <w:t xml:space="preserve">90 pruebas automáticas en tests/, todas en verde (pytest tests/ -v), cubriendo validación, clasificación, recursos del SO, adquisición (con sockets reales en hilo local), persistencia, el orquestador completo (incluyendo reconexión, fallas de persistencia y detención desde otro hilo), el servidor del dashboard con sus defensas, y el lanzador de la demo con el firmware como proceso real. La matriz completa, cruzando cada caso con su evidencia automática y manual, está en docs/Matriz_Pruebas.md. Construir la demo en vivo destapó tres defectos más, cada uno cubierto primero con una prueba que fallaba: un firmware "colgado" (conexión abierta, sin datos) tumbaba la aplicación; en Windows podían escuchar dos firmwares en el mismo puerto; y la CPU del dashboard marcaba siempre 0 %. El detalle está en docs/Fallos_Controlados.md.</w:t>
+        <w:t xml:space="preserve">95 pruebas automáticas en tests/, todas en verde (pytest tests/ -v), cubriendo validación, clasificación, recursos del SO, adquisición (con sockets reales en hilo local), persistencia, el orquestador completo (incluyendo reconexión, fallas de persistencia y detención desde otro hilo), el servidor del dashboard con sus defensas, y el lanzador de la demo con el firmware como proceso real. La matriz completa, cruzando cada caso con su evidencia automática y manual, está en docs/Matriz_Pruebas.md. Construir la demo en vivo destapó tres defectos más, cada uno cubierto primero con una prueba que fallaba: un firmware "colgado" (conexión abierta, sin datos) tumbaba la aplicación; en Windows podían escuchar dos firmwares en el mismo puerto; y la CPU del dashboard marcaba siempre 0 %. El detalle está en docs/Fallos_Controlados.md.</w:t>
       </w:r>
     </w:p>
     <w:p>

</xml_diff>